<commit_message>
GIS UPDATE and guide update
</commit_message>
<xml_diff>
--- a/USER_GUIDE_V2(UPDATED).docx
+++ b/USER_GUIDE_V2(UPDATED).docx
@@ -390,6 +390,30 @@
         <w:t>**Delete** a layer that is no longer needed</w:t>
       </w:r>
     </w:p>
+    <w:p>
+      <w:pPr>
+        <w:pStyle w:val="ListBullet"/>
+      </w:pPr>
+      <w:r>
+        <w:t>Filter shapefiles — type any keyword into the filter box beside the "Available Shapefiles" heading to instantly narrow the list to matching layers (e.g. type “bus” to surface all bus-related layers)</w:t>
+      </w:r>
+    </w:p>
+    <w:p>
+      <w:pPr>
+        <w:pStyle w:val="ListBullet"/>
+      </w:pPr>
+      <w:r>
+        <w:t>Rename a layer — click Edit next to any shapefile to give it a custom display name that is meaningful to your team. The rename takes effect immediately across the dashboard</w:t>
+      </w:r>
+    </w:p>
+    <w:p>
+      <w:pPr>
+        <w:pStyle w:val="ListBullet"/>
+      </w:pPr>
+      <w:r>
+        <w:t>Revert to original name — if a layer has been renamed, click Revert to restore its original filename at any time</w:t>
+      </w:r>
+    </w:p>
     <w:p/>
     <w:p>
       <w:r>
@@ -3080,6 +3104,30 @@
         <w:t>[8.5 Updating GIS Layers](#85-updating-gis-layers)</w:t>
       </w:r>
     </w:p>
+    <w:p>
+      <w:pPr>
+        <w:pStyle w:val="ListBullet"/>
+      </w:pPr>
+      <w:r>
+        <w:t>[8.6 Filtering Shapefiles](#86-filtering-shapefiles)</w:t>
+      </w:r>
+    </w:p>
+    <w:p>
+      <w:pPr>
+        <w:pStyle w:val="ListBullet"/>
+      </w:pPr>
+      <w:r>
+        <w:t>[8.7 Renaming a Shapefile](#87-renaming-a-shapefile)</w:t>
+      </w:r>
+    </w:p>
+    <w:p>
+      <w:pPr>
+        <w:pStyle w:val="ListBullet"/>
+      </w:pPr>
+      <w:r>
+        <w:t>[8.8 Reverting a Shapefile to Its Original Name](#88-reverting-a-shapefile-to-its-original-name)</w:t>
+      </w:r>
+    </w:p>
     <w:p/>
     <w:p>
       <w:r>
@@ -3134,6 +3182,22 @@
         <w:t>Preview any layer on an interactive map by clicking it</w:t>
       </w:r>
     </w:p>
+    <w:p>
+      <w:pPr>
+        <w:pStyle w:val="ListBullet"/>
+      </w:pPr>
+      <w:r>
+        <w:t>Filter the list instantly by typing a keyword into the filter box (see Section 8.6)</w:t>
+      </w:r>
+    </w:p>
+    <w:p>
+      <w:pPr>
+        <w:pStyle w:val="ListBullet"/>
+      </w:pPr>
+      <w:r>
+        <w:t>Rename any layer to a custom display name or revert it back to its original name (see Sections 8.7 and 8.8)</w:t>
+      </w:r>
+    </w:p>
     <w:p/>
     <w:p>
       <w:pPr>
@@ -3326,6 +3390,70 @@
         <w:t>**Preview**: Once uploaded, you can preview the geometry on the map before finalising.</w:t>
       </w:r>
     </w:p>
+    <w:p>
+      <w:pPr>
+        <w:pStyle w:val="Heading3"/>
+      </w:pPr>
+      <w:r>
+        <w:t>Before You Upload — Confirmation Prompt</w:t>
+      </w:r>
+    </w:p>
+    <w:p>
+      <w:pPr/>
+      <w:r>
+        <w:t>Before the file is accepted, PSAT displays a "Before You Upload" confirmation dialog. You must confirm that your shapefile meets all of the following requirements:</w:t>
+      </w:r>
+    </w:p>
+    <w:p>
+      <w:pPr>
+        <w:pStyle w:val="ListBullet"/>
+      </w:pPr>
+      <w:r>
+        <w:t>Exact file name — The file name must exactly match what the system expects.</w:t>
+      </w:r>
+    </w:p>
+    <w:p>
+      <w:pPr>
+        <w:pStyle w:val="ListBullet"/>
+      </w:pPr>
+      <w:r>
+        <w:t>Exact columns and numbers — The shapefile must contain the correct number of columns, with no extras or omissions.</w:t>
+      </w:r>
+    </w:p>
+    <w:p>
+      <w:pPr>
+        <w:pStyle w:val="ListBullet"/>
+      </w:pPr>
+      <w:r>
+        <w:t>Exact attribute names — Every column/attribute name must match exactly, including capitalisation.</w:t>
+      </w:r>
+    </w:p>
+    <w:p>
+      <w:pPr>
+        <w:pStyle w:val="ListBullet"/>
+      </w:pPr>
+      <w:r>
+        <w:t>Exact sequence — The columns must appear in exactly the same order as specified.</w:t>
+      </w:r>
+    </w:p>
+    <w:p>
+      <w:pPr/>
+      <w:r>
+        <w:t>Warning: Uploading an incompatible shapefile may cause system errors or incorrect data rendering.</w:t>
+      </w:r>
+    </w:p>
+    <w:p>
+      <w:pPr/>
+      <w:r>
+        <w:t>If you are unsure of the expected format, refer to the existing shapefiles in the GIS Layers list as a reference before uploading.</w:t>
+      </w:r>
+    </w:p>
+    <w:p>
+      <w:pPr/>
+      <w:r>
+        <w:t>Click Confirm &amp; Upload to proceed, or Cancel to go back and check your file.</w:t>
+      </w:r>
+    </w:p>
     <w:p/>
     <w:p>
       <w:pPr>
@@ -3442,6 +3570,226 @@
     <w:p>
       <w:r>
         <w:t>&gt; For system-level GIS management (file paths, permissions, bulk updates), refer to the Admin Guide.</w:t>
+      </w:r>
+    </w:p>
+    <w:p>
+      <w:pPr>
+        <w:pStyle w:val="Heading2"/>
+      </w:pPr>
+      <w:r>
+        <w:t>8.6 Filtering Shapefiles</w:t>
+      </w:r>
+    </w:p>
+    <w:p>
+      <w:pPr/>
+      <w:r>
+        <w:t>When your system has many GIS layers, scrolling through the full list can be slow. The filter box at the top of the Available Shapefiles panel lets you narrow the list instantly.</w:t>
+      </w:r>
+    </w:p>
+    <w:p>
+      <w:pPr/>
+      <w:r>
+        <w:t>How to use it:</w:t>
+      </w:r>
+    </w:p>
+    <w:p>
+      <w:pPr>
+        <w:pStyle w:val="ListBullet"/>
+      </w:pPr>
+      <w:r>
+        <w:t>Open the GIS Layers page from the sidebar</w:t>
+      </w:r>
+    </w:p>
+    <w:p>
+      <w:pPr>
+        <w:pStyle w:val="ListBullet"/>
+      </w:pPr>
+      <w:r>
+        <w:t>Click the Filter shapefiles… input field beside the “Available Shapefiles” heading</w:t>
+      </w:r>
+    </w:p>
+    <w:p>
+      <w:pPr>
+        <w:pStyle w:val="ListBullet"/>
+      </w:pPr>
+      <w:r>
+        <w:t>Type any keyword — the list updates in real time to show only layers whose name contains your search term (the search is case-insensitive)</w:t>
+      </w:r>
+    </w:p>
+    <w:p>
+      <w:pPr>
+        <w:pStyle w:val="ListBullet"/>
+      </w:pPr>
+      <w:r>
+        <w:t>Clear the field to restore the full list</w:t>
+      </w:r>
+    </w:p>
+    <w:p>
+      <w:pPr/>
+      <w:r>
+        <w:t>Examples:</w:t>
+      </w:r>
+    </w:p>
+    <w:p>
+      <w:pPr/>
+      <w:r>
+        <w:t>| count | AMGbeforeCount, AMGsensorCount … |</w:t>
+      </w:r>
+    </w:p>
+    <w:p>
+      <w:pPr/>
+      <w:r>
+        <w:t>&gt; If no layers match your search term, the panel displays a “No shapefiles match …” message.</w:t>
+      </w:r>
+    </w:p>
+    <w:p>
+      <w:pPr>
+        <w:pStyle w:val="Heading2"/>
+      </w:pPr>
+      <w:r>
+        <w:t>8.7 Renaming a Shapefile</w:t>
+      </w:r>
+    </w:p>
+    <w:p>
+      <w:pPr/>
+      <w:r>
+        <w:t>You can give any shapefile a custom display name to make it easier to identify within your team’s workflow. The rename only affects how the layer appears in the PSAT dashboard — the underlying file on disk is not moved or changed.</w:t>
+      </w:r>
+    </w:p>
+    <w:p>
+      <w:pPr/>
+      <w:r>
+        <w:t>Steps:</w:t>
+      </w:r>
+    </w:p>
+    <w:p>
+      <w:pPr>
+        <w:pStyle w:val="ListBullet"/>
+      </w:pPr>
+      <w:r>
+        <w:t>Open the GIS Layers page from the sidebar</w:t>
+      </w:r>
+    </w:p>
+    <w:p>
+      <w:pPr>
+        <w:pStyle w:val="ListBullet"/>
+      </w:pPr>
+      <w:r>
+        <w:t>Locate the shapefile you want to rename (use the filter box if needed)</w:t>
+      </w:r>
+    </w:p>
+    <w:p>
+      <w:pPr>
+        <w:pStyle w:val="ListBullet"/>
+      </w:pPr>
+      <w:r>
+        <w:t>Click the Edit button on the right side of the layer row</w:t>
+      </w:r>
+    </w:p>
+    <w:p>
+      <w:pPr>
+        <w:pStyle w:val="ListBullet"/>
+      </w:pPr>
+      <w:r>
+        <w:t>The layer name becomes an editable text field — type your new name</w:t>
+      </w:r>
+    </w:p>
+    <w:p>
+      <w:pPr>
+        <w:pStyle w:val="ListBullet"/>
+      </w:pPr>
+      <w:r>
+        <w:t>Press Enter or click the save (✓) button to confirm</w:t>
+      </w:r>
+    </w:p>
+    <w:p>
+      <w:pPr>
+        <w:pStyle w:val="ListBullet"/>
+      </w:pPr>
+      <w:r>
+        <w:t>Press Escape or click the cancel (✕) button to discard the change</w:t>
+      </w:r>
+    </w:p>
+    <w:p>
+      <w:pPr/>
+      <w:r>
+        <w:t>&gt; Renamed layers retain all their original metadata, required columns, geometry, and category. Only the display name is updated.</w:t>
+      </w:r>
+    </w:p>
+    <w:p>
+      <w:pPr>
+        <w:pStyle w:val="Heading2"/>
+      </w:pPr>
+      <w:r>
+        <w:t>8.8 Reverting a Shapefile to Its Original Name</w:t>
+      </w:r>
+    </w:p>
+    <w:p>
+      <w:pPr/>
+      <w:r>
+        <w:t>If a layer has been renamed and you want to restore its original filename as the display name, use the Revert option.</w:t>
+      </w:r>
+    </w:p>
+    <w:p>
+      <w:pPr/>
+      <w:r>
+        <w:t>Steps:</w:t>
+      </w:r>
+    </w:p>
+    <w:p>
+      <w:pPr>
+        <w:pStyle w:val="ListBullet"/>
+      </w:pPr>
+      <w:r>
+        <w:t>Open the GIS Layers page from the sidebar</w:t>
+      </w:r>
+    </w:p>
+    <w:p>
+      <w:pPr>
+        <w:pStyle w:val="ListBullet"/>
+      </w:pPr>
+      <w:r>
+        <w:t>Locate the renamed shapefile (a Revert button will be visible next to Edit)</w:t>
+      </w:r>
+    </w:p>
+    <w:p>
+      <w:pPr>
+        <w:pStyle w:val="ListBullet"/>
+      </w:pPr>
+      <w:r>
+        <w:t>Click Revert</w:t>
+      </w:r>
+    </w:p>
+    <w:p>
+      <w:pPr>
+        <w:pStyle w:val="ListBullet"/>
+      </w:pPr>
+      <w:r>
+        <w:t>Confirm the action — the display name immediately reverts to the layer’s original filename</w:t>
+      </w:r>
+    </w:p>
+    <w:p>
+      <w:pPr/>
+      <w:r>
+        <w:t>&gt; The Revert button only appears on layers that have been given a custom name. Layers still showing their original name will not have this option.</w:t>
+      </w:r>
+    </w:p>
+    <w:p>
+      <w:pPr/>
+      <w:r>
+        <w:t>| path | cycling_path, shared_path, footpath, CyclingPath_Jul2024 … |</w:t>
+      </w:r>
+    </w:p>
+    <w:p>
+      <w:pPr/>
+      <w:r>
+        <w:t>| bus | bus_stop, bus_lane, bus_shelter … |</w:t>
+      </w:r>
+    </w:p>
+    <w:p>
+      <w:pPr/>
+      <w:r>
+        <w:t>| What you type | Layers shown |</w:t>
       </w:r>
     </w:p>
     <w:p/>

</xml_diff>